<commit_message>
Sprint 1 theo đúng 4 bước (phân tích → tài liệu chi tiết → BPD → code)
</commit_message>
<xml_diff>
--- a/QLTruongHoc/BPD_App_Quan_Ly_Truong_Hoc_Trung_Tam_v0.1.docx
+++ b/QLTruongHoc/BPD_App_Quan_Ly_Truong_Hoc_Trung_Tam_v0.1.docx
@@ -9488,6 +9488,75 @@
       </w:pPr>
       <w:r>
         <w:t>Chi tiết phân tích đầy đủ: docs/analysis/menu_theo_quyen_va_loai_hinh.md trong repo code.</w:t>
+      </w:r>
+    </w:p>
+    <w:p>
+      <w:pPr>
+        <w:pStyle w:val="Heading3"/>
+      </w:pPr>
+      <w:r>
+        <w:t>18.3 D01/D03 — Hồ sơ học sinh và phụ huynh (2026-07-21)</w:t>
+      </w:r>
+    </w:p>
+    <w:p>
+      <w:r>
+        <w:t>Phạm vi: chỉ hồ sơ học sinh, hồ sơ phụ huynh và liên kết giữa hai bên. Chưa gồm tài khoản đăng nhập phụ huynh (để bước sau, phụ thuộc bước này) và chưa gồm luồng Lead / tuyển sinh (C01-C06, cũng để bước sau). Quyết định:</w:t>
+      </w:r>
+    </w:p>
+    <w:p>
+      <w:pPr>
+        <w:pStyle w:val="ListBullet"/>
+      </w:pPr>
+      <w:r>
+        <w:t>Mã học sinh (maHocSinh) do hệ thống tự sinh theo đơn vị, không cho nhập tay, để tránh trùng và sai định dạng.</w:t>
+      </w:r>
+    </w:p>
+    <w:p>
+      <w:pPr>
+        <w:pStyle w:val="ListBullet"/>
+      </w:pPr>
+      <w:r>
+        <w:t>Một phụ huynh có thể là người giám hộ của nhiều học sinh trong cùng đơn vị. Khi thêm phụ huynh cho một học sinh, hệ thống dò theo số điện thoại trong cùng đơn vị trước — nếu đã tồn tại phụ huynh với số điện thoại đó thì tái sử dụng hồ sơ cũ, không tạo phụ huynh trùng.</w:t>
+      </w:r>
+    </w:p>
+    <w:p>
+      <w:pPr>
+        <w:pStyle w:val="ListBullet"/>
+      </w:pPr>
+      <w:r>
+        <w:t>Một học sinh có thể có nhiều người giám hộ nhưng tại một thời điểm chỉ có đúng một người là liên hệ chính; đặt liên hệ chính mới sẽ tự bỏ đánh dấu liên hệ chính cũ.</w:t>
+      </w:r>
+    </w:p>
+    <w:p>
+      <w:pPr>
+        <w:pStyle w:val="ListBullet"/>
+      </w:pPr>
+      <w:r>
+        <w:t>Không cho gỡ liên kết phụ huynh nếu đó là liên hệ chính duy nhất còn phụ huynh khác chưa được chỉ định lại, và không cho gỡ liên kết cuối cùng của một học sinh.</w:t>
+      </w:r>
+    </w:p>
+    <w:p>
+      <w:pPr>
+        <w:pStyle w:val="ListBullet"/>
+      </w:pPr>
+      <w:r>
+        <w:t>Đổi trạng thái học sinh không xoá hồ sơ, không xoá liên kết phụ huynh — giữ lịch sử đúng nguyên tắc chung của BPD.</w:t>
+      </w:r>
+    </w:p>
+    <w:p>
+      <w:pPr>
+        <w:pStyle w:val="ListBullet"/>
+      </w:pPr>
+      <w:r>
+        <w:t>Không thêm trường riêng theo loại hình đào tạo ở bước này (hồ sơ sức khỏe mầm non, người đón trẻ chi tiết để lại Sprint 7) — tránh cấu hình sớm khi chưa cần.</w:t>
+      </w:r>
+    </w:p>
+    <w:p>
+      <w:pPr>
+        <w:pStyle w:val="ListBullet"/>
+      </w:pPr>
+      <w:r>
+        <w:t>Chi tiết phân tích đầy đủ: docs/analysis/D01_D03_ho_so_hoc_sinh_phu_huynh.md trong repo code.</w:t>
       </w:r>
     </w:p>
     <w:sectPr>

</xml_diff>

<commit_message>
Mo Sprint 5 (Tai chinh): hoan tat H01/H02 - danh muc khoan thu, ky thu
- Database: DanhMucKhoanThu, KyThu, KyThuKhoanThu (database/017)
- Backend: /api/tai-chinh (CRUD khoan thu, CRUD ky thu, gan khoan
  thu ap dung theo kieu thay toan bo danh sach, mo/dong ky thu voi
  rang buoc mot chieu nhap -> da_mo -> da_dong)
- Frontend: trang /finance va /finance/ky-thu/:id thay PlaceholderPage
- Tai su dung quyen tai_chinh.xem/tai_chinh.quan_ly da seed san,
  khong tao quyen moi
- Cap nhat BPD muc 18.13, PROJECT_SUMMARY, checklist H01/H02
- Don code rac storeDutyAccessService.ts sot lai tu template goc
  (da xoa o commit truoc, ghi nhan lai trong tai lieu)
</commit_message>
<xml_diff>
--- a/QLTruongHoc/BPD_App_Quan_Ly_Truong_Hoc_Trung_Tam_v0.1.docx
+++ b/QLTruongHoc/BPD_App_Quan_Ly_Truong_Hoc_Trung_Tam_v0.1.docx
@@ -10034,6 +10034,59 @@
       </w:pPr>
       <w:r>
         <w:t>Chi tiết phân tích đầy đủ: docs/analysis/G01_G02_G03_bao_giang.md trong repo code.</w:t>
+      </w:r>
+    </w:p>
+    <w:p>
+      <w:pPr>
+        <w:pStyle w:val="Heading3"/>
+      </w:pPr>
+      <w:r>
+        <w:t>18.13 H01/H02 — Danh mục khoản thu, Kỳ thu (2026-07-22)</w:t>
+      </w:r>
+    </w:p>
+    <w:p>
+      <w:r>
+        <w:t>Mở Sprint 5 (Tài chính). Phạm vi: danh mục khoản thu, kỳ thu, gán khoản thu áp dụng cho kỳ, mở/đóng kỳ thu. Chưa gồm H03-H09 (sinh khoản phải thu theo lớp/học sinh, thu tiền từng phần, miễn giảm, công nợ, biên nhận, hoàn phí/chuyển phí/bảo lưu, báo cáo doanh thu) — để lại làm slice tiếp theo.</w:t>
+      </w:r>
+    </w:p>
+    <w:p>
+      <w:pPr>
+        <w:pStyle w:val="ListBullet"/>
+      </w:pPr>
+      <w:r>
+        <w:t>Mã khoản thu/kỳ thu nhân viên tự đặt (giống chương trình đào tạo/lớp học), không tự sinh như mã học sinh/phụ huynh/lead.</w:t>
+      </w:r>
+    </w:p>
+    <w:p>
+      <w:pPr>
+        <w:pStyle w:val="ListBullet"/>
+      </w:pPr>
+      <w:r>
+        <w:t>Kỳ thu có 3 trạng thái một chiều: nhap (sửa được) → da_mo (khoá sửa thông tin và khoản thu áp dụng) → da_dong, không quay lại được. Mở kỳ bắt buộc phải có ít nhất một khoản thu áp dụng.</w:t>
+      </w:r>
+    </w:p>
+    <w:p>
+      <w:pPr>
+        <w:pStyle w:val="ListBullet"/>
+      </w:pPr>
+      <w:r>
+        <w:t>Gán khoản thu áp dụng cho kỳ theo kiểu thay toàn bộ danh sách (xoá hết rồi chèn lại), cùng nguyên tắc với lưu điểm danh hàng loạt. Không cho gán khoản thu đã ngừng áp dụng vào kỳ thu mới.</w:t>
+      </w:r>
+    </w:p>
+    <w:p>
+      <w:pPr>
+        <w:pStyle w:val="ListBullet"/>
+      </w:pPr>
+      <w:r>
+        <w:t>Tái sử dụng quyền tai_chinh.xem/tai_chinh.quan_ly đã seed sẵn từ Sprint 0 và đã gán cho kế toán/quản lý đơn vị, không tạo quyền mới.</w:t>
+      </w:r>
+    </w:p>
+    <w:p>
+      <w:pPr>
+        <w:pStyle w:val="ListBullet"/>
+      </w:pPr>
+      <w:r>
+        <w:t>Chi tiết phân tích đầy đủ: docs/analysis/H01_H02_khoan_thu_ky_thu.md trong repo code.</w:t>
       </w:r>
     </w:p>
     <w:sectPr>

</xml_diff>

<commit_message>
Sprint 5 (Tai chinh): hoan tat H03-H07 - khoan phai thu, mien giam, thu tien, cong no, bien nhan
- Database: KhoanPhaiThu, KhoanPhaiThuChiTiet, PhieuThu (database/018)
- Backend: sinh khoan phai thu theo lop (idempotent), mien giam,
  thu tien tung phan/nhieu lan (nhieu PhieuThu tren 1 KhoanPhaiThu),
  xem cong no toan don vi, xem lich su phieu thu. Dong ky thu khoa
  ca mien giam/thu tien, khong chi khoa sua thong tin ky.
- Frontend: KyThuDetailPage them sinh khoan phai thu + bang khoan
  phai thu + panel thao tac (thu tien/mien giam/lich su, 1 panel
  tai 1 thoi diem); FinancePage them muc Cong no
- Ma phieu thu tu sinh PT<nam><5 so>
- Cap nhat BPD muc 18.14, PROJECT_SUMMARY, checklist H03-H07
</commit_message>
<xml_diff>
--- a/QLTruongHoc/BPD_App_Quan_Ly_Truong_Hoc_Trung_Tam_v0.1.docx
+++ b/QLTruongHoc/BPD_App_Quan_Ly_Truong_Hoc_Trung_Tam_v0.1.docx
@@ -10087,6 +10087,75 @@
       </w:pPr>
       <w:r>
         <w:t>Chi tiết phân tích đầy đủ: docs/analysis/H01_H02_khoan_thu_ky_thu.md trong repo code.</w:t>
+      </w:r>
+    </w:p>
+    <w:p>
+      <w:pPr>
+        <w:pStyle w:val="Heading3"/>
+      </w:pPr>
+      <w:r>
+        <w:t>18.14 H03-H07 — Khoản phải thu, miễn giảm, thu tiền, công nợ, biên nhận (2026-07-22)</w:t>
+      </w:r>
+    </w:p>
+    <w:p>
+      <w:r>
+        <w:t>Tiếp H01/H02 (mục 18.13). Phạm vi: sinh khoản phải thu cho từng học sinh theo lớp, miễn giảm, thu tiền từng phần/nhiều lần, xem công nợ toàn đơn vị, xem lịch sử phiếu thu (biên nhận). Chưa gồm H08 (hoàn phí/chuyển phí/bảo lưu) và H09 (báo cáo doanh thu tổng hợp có biểu đồ) — để lại làm bước sau.</w:t>
+      </w:r>
+    </w:p>
+    <w:p>
+      <w:pPr>
+        <w:pStyle w:val="ListBullet"/>
+      </w:pPr>
+      <w:r>
+        <w:t>Đơn giản hoá lớn nhất so với bản nháp database/003_init_finance_learning.sql: một phiếu thu gắn đúng một khoản phải thu (không có PhieuThuChiTiet nhiều khoản/phiếu). Thu nhiều lần vẫn đủ vì một khoản phải thu nhận được nhiều phiếu thu cho tới khi thu đủ.</w:t>
+      </w:r>
+    </w:p>
+    <w:p>
+      <w:pPr>
+        <w:pStyle w:val="ListBullet"/>
+      </w:pPr>
+      <w:r>
+        <w:t>conLai tính trong tầng service (tongTien - giamTru - daThu), không dùng generated column của MySQL, để không phụ thuộc cách Drizzle ORM xử lý generated column khi update.</w:t>
+      </w:r>
+    </w:p>
+    <w:p>
+      <w:pPr>
+        <w:pStyle w:val="ListBullet"/>
+      </w:pPr>
+      <w:r>
+        <w:t>Đóng kỳ thu khoá luôn cả miễn giảm và thu tiền (không chỉ khoá sửa thông tin kỳ như đã chốt ở mục 18.13) — chốt sổ đúng nghĩa, kể cả khoản phải thu chưa thu đủ.</w:t>
+      </w:r>
+    </w:p>
+    <w:p>
+      <w:pPr>
+        <w:pStyle w:val="ListBullet"/>
+      </w:pPr>
+      <w:r>
+        <w:t>Sinh khoản phải thu theo lớp có tính chất idempotent: bỏ qua học sinh đã có khoản phải thu cho đúng kỳ đó, chạy lại nhiều lớp/nhiều lần không tạo trùng.</w:t>
+      </w:r>
+    </w:p>
+    <w:p>
+      <w:pPr>
+        <w:pStyle w:val="ListBullet"/>
+      </w:pPr>
+      <w:r>
+        <w:t>Trạng thái khoản phải thu (chua_thu/thu_mot_phan/da_thu_du) luôn suy ra tự động từ số liệu, không cho sửa tay. Mã phiếu thu tự sinh PT&lt;năm&gt;&lt;5 số&gt;.</w:t>
+      </w:r>
+    </w:p>
+    <w:p>
+      <w:pPr>
+        <w:pStyle w:val="ListBullet"/>
+      </w:pPr>
+      <w:r>
+        <w:t>Tái sử dụng quyền tai_chinh.xem/tai_chinh.quan_ly đã seed sẵn, không tạo quyền mới.</w:t>
+      </w:r>
+    </w:p>
+    <w:p>
+      <w:pPr>
+        <w:pStyle w:val="ListBullet"/>
+      </w:pPr>
+      <w:r>
+        <w:t>Chi tiết phân tích đầy đủ: docs/analysis/H03_H07_khoan_phai_thu_thu_tien.md trong repo code.</w:t>
       </w:r>
     </w:p>
     <w:sectPr>

</xml_diff>

<commit_message>
Sprint 5 (Tai chinh): hoan tat H09 - bao cao tai chinh
- Backend: bao cao tong hop (tong thu trong khoang ngay loc theo
  PhieuThu.ngayThu, tong cong no hien tai khong loc ngay, bang
  thu theo tung ky thu luy ke) - GET /api/tai-chinh/bao-cao
- Frontend: trang /finance/bao-cao, nut lien ket tu header /finance
- Khong them bang moi, chi truy van tong hop tren du lieu H01-H07
- Cap nhat BPD muc 18.15, PROJECT_SUMMARY, checklist H09

Sprint 5 con lai dung 1 muc: H08 (hoan phi/chuyen phi/bao luu).
</commit_message>
<xml_diff>
--- a/QLTruongHoc/BPD_App_Quan_Ly_Truong_Hoc_Trung_Tam_v0.1.docx
+++ b/QLTruongHoc/BPD_App_Quan_Ly_Truong_Hoc_Trung_Tam_v0.1.docx
@@ -10156,6 +10156,59 @@
       </w:pPr>
       <w:r>
         <w:t>Chi tiết phân tích đầy đủ: docs/analysis/H03_H07_khoan_phai_thu_thu_tien.md trong repo code.</w:t>
+      </w:r>
+    </w:p>
+    <w:p>
+      <w:pPr>
+        <w:pStyle w:val="Heading3"/>
+      </w:pPr>
+      <w:r>
+        <w:t>18.15 H09 — Báo cáo tài chính (2026-07-22)</w:t>
+      </w:r>
+    </w:p>
+    <w:p>
+      <w:r>
+        <w:t>Tiếp H03-H07 (mục 18.14). Phạm vi: tổng thu trong khoảng ngày, tổng công nợ hiện tại, bảng thu theo từng kỳ thu. Chỉ còn H08 (hoàn phí/chuyển phí/bảo lưu) chưa làm trong Sprint 5 — để lại làm bước riêng vì cần thiết kế nghiệp vụ phức tạp hơn.</w:t>
+      </w:r>
+    </w:p>
+    <w:p>
+      <w:pPr>
+        <w:pStyle w:val="ListBullet"/>
+      </w:pPr>
+      <w:r>
+        <w:t>Quyết định quan trọng nhất: tổng thu lọc theo ngày (PhieuThu.ngayThu trong khoảng chọn), còn công nợ và bảng theo kỳ thu KHÔNG lọc theo ngày (luôn là số dư/luỹ kế hiện tại) — tránh trộn hai trục thời gian gây khó hiểu.</w:t>
+      </w:r>
+    </w:p>
+    <w:p>
+      <w:pPr>
+        <w:pStyle w:val="ListBullet"/>
+      </w:pPr>
+      <w:r>
+        <w:t>Không thêm bảng mới — chỉ thêm truy vấn tổng hợp (SUM/COUNT/GROUP BY) trên các bảng đã có từ H01-H07.</w:t>
+      </w:r>
+    </w:p>
+    <w:p>
+      <w:pPr>
+        <w:pStyle w:val="ListBullet"/>
+      </w:pPr>
+      <w:r>
+        <w:t>Đơn vị hệ thống xem gộp toàn bộ đơn vị đang hoạt động, bảng theo kỳ thu thêm cột Đơn vị — đúng nguyên tắc xem gộp đã dùng ở các module khác.</w:t>
+      </w:r>
+    </w:p>
+    <w:p>
+      <w:pPr>
+        <w:pStyle w:val="ListBullet"/>
+      </w:pPr>
+      <w:r>
+        <w:t>Tái sử dụng quyền tai_chinh.xem, không tạo quyền mới.</w:t>
+      </w:r>
+    </w:p>
+    <w:p>
+      <w:pPr>
+        <w:pStyle w:val="ListBullet"/>
+      </w:pPr>
+      <w:r>
+        <w:t>Chi tiết phân tích đầy đủ: docs/analysis/H09_bao_cao_tai_chinh.md trong repo code.</w:t>
       </w:r>
     </w:p>
     <w:sectPr>

</xml_diff>